<commit_message>
Version 1.2: afterword dropped from the book, memorandum returned as closing annex, costs folded into the price, companion paper re-based
</commit_message>
<xml_diff>
--- a/Mere_Catholicity_Logos.docx
+++ b/Mere_Catholicity_Logos.docx
@@ -192,7 +192,7 @@
         <w:br/>
       </w:r>
       <w:r>
-        <w:t xml:space="preserve">Print version 1.1, July 19, 2026</w:t>
+        <w:t xml:space="preserve">Print version 1.2, July 22, 2026</w:t>
       </w:r>
       <w:r>
         <w:br/>
@@ -822,7 +822,7 @@
         <w:pStyle w:val="FirstParagraph"/>
       </w:pPr>
       <w:r>
-        <w:t xml:space="preserve">The expansive doctrine of invincible ignorance and baptism of desire, in the form that softens Florence, is largely a second-millennium and modern Western growth. Trent gestures at the desire for baptism, Pius IX draws it out in 1854 and 1863, and the twentieth century widens it further. The Fathers were on the whole harsher, and St. Augustine, against the Pelagians, harsher still. The defense is St. Vincent’s own, growth in the same sense. The principle is first-millennial in seed, that God is not bound by His own sacraments, that the martyr is saved by a baptism of blood, that St. Ambrose could commend the catechumen Valentinian who died unbaptized. Drawing this principle out is development in the same sense, not a change of sense, and by that test it is licit where Vatican I is not. What is genuinely modern is not the principle but the optimism about how many it reaches, and that is held here as hope, not as dogma, with the Fathers of mercy named in the recommended reading.</w:t>
+        <w:t xml:space="preserve">The expansive doctrine of invincible ignorance and baptism of desire, in the form that softens Florence, is largely a second-millennium and modern Western growth. Trent gestures at the desire for baptism, Pius IX draws it out in 1854 and 1863, and the twentieth century widens it further. The Fathers were on the whole harsher, and St. Augustine, against the Pelagians, harsher still. The defense is St. Vincent’s own, growth in the same sense. The principle is first-millennial in seed, that God is not bound by His own sacraments, that the martyr is saved by a baptism of blood, that St. Ambrose could commend the catechumen Valentinian who died unbaptized. Drawing this principle out is development in the same sense, not a change of sense, and by that test it is licit where Vatican I is not. What is genuinely modern is not the principle but the optimism about how many it reaches, and that is held here as hope, not as dogma, with the Fathers of mercy, St. Isaac the Syrian and St. Gregory of Nyssa, as its witnesses.</w:t>
       </w:r>
     </w:p>
     <w:bookmarkEnd w:id="40"/>
@@ -1354,7 +1354,7 @@
         <w:pStyle w:val="FirstParagraph"/>
       </w:pPr>
       <w:r>
-        <w:t xml:space="preserve">The strongest case against this structure is John Henry Newman’s. Doctrine truly develops, and to tell a true development from a corruption calls for a living authority that can judge in the present. That is his argument for Rome, and the reason his book stands in the recommended reading under the criterion and the method, not among the settled things. The problem is granted. Reception judges only in retrospect, and cannot, in the moment, do what he asks. But his remedy is answered by its record, joined to the circle owned in this section. His instrument, carried forward, produced the definitions of 1854, 1870, and 1950, which the other ancient communions have never accepted. To call them unreceived developments rather than identified ones already presupposes this confession’s criterion, and Newman would say exactly that, for on his account the living act itself identifies the true development. So the reply does not land on his ground. It lands on the shared record and on the choice of circles this section confesses, and the record now splits the charge into a dilemma. Where the content was already ripening in the channel, as with 1950, the act added nothing the channel was not doing and claimed a finality it could not deliver, and this stands on Rome’s own record, for Pius XII polled the world’s episcopate in 1946 and the bull grounds the definition in the Church’s standing and near-unanimous faith, so by its own testimony the content preceded the act and the act’s sole addition was the claim of unilateral finality, the precise item in dispute. Where it was not, as with 1854 and 1870, the act produced dogma the other ancient communions have never accepted. Either horn indicts the mechanism, redundant where the Body was confessing and productive of the unreceived where it was not. The choice is exact. His certainty in the present comes at the price of a magisterium that has defined against the first millennium. This retrospective humility comes at the price of no guarantee in the present. We keep his method, that doctrine develops and must be tested, while declining his authority, and we pay the price he named rather than pretend it is not there.</w:t>
+        <w:t xml:space="preserve">The strongest case against this structure is John Henry Newman’s. Doctrine truly develops, and to tell a true development from a corruption calls for a living authority that can judge in the present. That is his argument for Rome. The problem is granted. Reception judges only in retrospect, and cannot, in the moment, do what he asks. But his remedy is answered by its record, joined to the circle owned in this section. His instrument, carried forward, produced the definitions of 1854, 1870, and 1950, which the other ancient communions have never accepted. To call them unreceived developments rather than identified ones already presupposes this confession’s criterion, and Newman would say exactly that, for on his account the living act itself identifies the true development. So the reply does not land on his ground. It lands on the shared record and on the choice of circles this section confesses, and the record now splits the charge into a dilemma. Where the content was already ripening in the channel, as with 1950, the act added nothing the channel was not doing and claimed a finality it could not deliver, and this stands on Rome’s own record, for Pius XII polled the world’s episcopate in 1946 and the bull grounds the definition in the Church’s standing and near-unanimous faith, so by its own testimony the content preceded the act and the act’s sole addition was the claim of unilateral finality, the precise item in dispute. Where it was not, as with 1854 and 1870, the act produced dogma the other ancient communions have never accepted. Either horn indicts the mechanism, redundant where the Body was confessing and productive of the unreceived where it was not. The choice is exact. His certainty in the present comes at the price of a magisterium that has defined against the first millennium. This retrospective humility comes at the price of no guarantee in the present. We keep his method, that doctrine develops and must be tested, while declining his authority, and we pay the price he named rather than pretend it is not there.</w:t>
       </w:r>
     </w:p>
     <w:bookmarkEnd w:id="53"/>
@@ -2120,7 +2120,7 @@
         <w:pStyle w:val="BodyText"/>
       </w:pPr>
       <w:r>
-        <w:t xml:space="preserve">Practice. The home altar. Practical communion between the communions of this tier remains divided, since the Orthodox keep a closed altar. Each believer is rooted in one and visits the others in charity. For Scranton, worship freely. Whether to make it home turns on who is asking, as section 8 and the afterword weigh it.</w:t>
+        <w:t xml:space="preserve">Practice. The home altar. Practical communion between the communions of this tier remains divided, since the Orthodox keep a closed altar. Each believer is rooted in one and visits the others in charity. For Scranton, worship freely. Whether to make it home turns on who is asking, as section 8 weighs it.</w:t>
       </w:r>
     </w:p>
     <w:bookmarkEnd w:id="78"/>
@@ -2180,7 +2180,7 @@
         <w:pStyle w:val="BodyText"/>
       </w:pPr>
       <w:r>
-        <w:t xml:space="preserve">Standing. The real presence, yes. Baptismal regeneration, yes, affirmed without qualification in the Small Catechism. The historic episcopate is lacking, though what presbyteral succession preserves is a real question, recorded in the afterword rather than closed here.</w:t>
+        <w:t xml:space="preserve">Standing. The real presence, yes. Baptismal regeneration, yes, affirmed without qualification in the Small Catechism. The historic episcopate is lacking, though what presbyteral succession preserves is a real question, weighed in the companion paper The bishop and the presbyter and held open here.</w:t>
       </w:r>
     </w:p>
     <w:p>
@@ -4477,7 +4477,7 @@
         <w:pStyle w:val="BodyText"/>
       </w:pPr>
       <w:r>
-        <w:t xml:space="preserve">The scriptural ground is twofold. Genesis 9:6 roots the penalty in the image of God, before Moses and addressed to mankind, and Romans 13:4 teaches that the magistrate does not bear the sword in vain, God’s servant and an avenger who carries out wrath. The second text is apostolic teaching to a Church under Roman jurisdiction, not a Mosaic precept, so it survives the cut that follows, and it is harder to read as merely descriptive than the first. The Mosaic judicial precepts themselves, such as the rule of Numbers 35:31 against ransoming a murderer’s life, are dead on the cessation of the Law’s judicial precepts that this confession’s own recommended reading commends (Summa I-II q. 104 a. 3, the division itself at q. 99), and may not be cited as presently binding. Genesis 9:6 is contested, prescriptive on the traditional reading and descriptive on another.</w:t>
+        <w:t xml:space="preserve">The scriptural ground is twofold. Genesis 9:6 roots the penalty in the image of God, before Moses and addressed to mankind, and Romans 13:4 teaches that the magistrate does not bear the sword in vain, God’s servant and an avenger who carries out wrath. The second text is apostolic teaching to a Church under Roman jurisdiction, not a Mosaic precept, so it survives the cut that follows, and it is harder to read as merely descriptive than the first. The Mosaic judicial precepts themselves, such as the rule of Numbers 35:31 against ransoming a murderer’s life, are dead on the cessation of the Law’s judicial precepts (Summa I-II q. 104 a. 3, the division itself at q. 99), and may not be cited as presently binding. Genesis 9:6 is contested, prescriptive on the traditional reading and descriptive on another.</w:t>
       </w:r>
     </w:p>
     <w:p>
@@ -4785,327 +4785,60 @@
     </w:p>
     <w:bookmarkEnd w:id="115"/>
     <w:bookmarkEnd w:id="116"/>
-    <w:bookmarkStart w:id="132" w:name="afterword.-counsel-for-the-layman"/>
+    <w:bookmarkStart w:id="124" w:name="annex.-the-memorandum"/>
     <w:p>
       <w:pPr>
         <w:pStyle w:val="Heading1"/>
       </w:pPr>
       <w:r>
-        <w:t xml:space="preserve">Afterword. Counsel for the layman</w:t>
-      </w:r>
-    </w:p>
-    <w:p>
-      <w:pPr>
-        <w:pStyle w:val="BlockText"/>
+        <w:t xml:space="preserve">Annex. The memorandum</w:t>
+      </w:r>
+    </w:p>
+    <w:p>
+      <w:pPr>
+        <w:pStyle w:val="FirstParagraph"/>
       </w:pPr>
       <w:r>
         <w:rPr>
           <w:i/>
           <w:iCs/>
         </w:rPr>
-        <w:t xml:space="preserve">“I wish it need not have happened in my time,”</w:t>
-      </w:r>
-      <w:r>
-        <w:rPr>
-          <w:i/>
-          <w:iCs/>
-        </w:rPr>
-        <w:t xml:space="preserve"> </w:t>
-      </w:r>
-      <w:r>
-        <w:rPr>
-          <w:i/>
-          <w:iCs/>
-        </w:rPr>
-        <w:t xml:space="preserve">said Frodo.</w:t>
-      </w:r>
-    </w:p>
-    <w:p>
-      <w:pPr>
-        <w:pStyle w:val="BlockText"/>
-      </w:pPr>
-      <w:r>
-        <w:t xml:space="preserve">“So do I,”</w:t>
-      </w:r>
-      <w:r>
-        <w:t xml:space="preserve"> </w:t>
-      </w:r>
-      <w:r>
-        <w:t xml:space="preserve">said Gandalf,</w:t>
-      </w:r>
-      <w:r>
-        <w:t xml:space="preserve"> </w:t>
-      </w:r>
-      <w:r>
-        <w:t xml:space="preserve">“and so do all who live to see such times. But that is not for them to decide. All we have to decide is what to do with the time that is given us.”</w:t>
-      </w:r>
-    </w:p>
-    <w:p>
-      <w:pPr>
-        <w:pStyle w:val="BlockText"/>
-      </w:pPr>
-      <w:r>
-        <w:t xml:space="preserve">J. R. R. Tolkien, The Fellowship of the Ring</w:t>
-      </w:r>
-    </w:p>
-    <w:p>
-      <w:pPr>
-        <w:pStyle w:val="FirstParagraph"/>
-      </w:pPr>
-      <w:r>
-        <w:t xml:space="preserve">This afterword is counsel for the layman, for the one who stands where we stood and for the one who is persuaded and must live accordingly in the meantime.</w:t>
-      </w:r>
-    </w:p>
-    <w:bookmarkStart w:id="117" w:name="what-led-to-this"/>
-    <w:p>
-      <w:pPr>
-        <w:pStyle w:val="Heading2"/>
-      </w:pPr>
-      <w:r>
-        <w:t xml:space="preserve">What led to this</w:t>
-      </w:r>
-    </w:p>
-    <w:p>
-      <w:pPr>
-        <w:pStyle w:val="FirstParagraph"/>
-      </w:pPr>
-      <w:r>
-        <w:t xml:space="preserve">This paper began as a conversation between friends in the weeks around the schism of 2026, when the Society of Saint Pius X, the largest fraternity of Catholic traditionalists, consecrated four bishops against the pope’s command and was declared schismatic. We love the old Latin Mass and know the traditionalist world from inside. The schism did not leave us without altars, for the priestly fraternities in full communion remain. It forced a question no altar answers. The first conversation began from the dilemma as one of us put it. To be faithful to the pope and the church of today, you must be unfaithful to the church of a century ago, and to be faithful to what the church taught until 1958, you must be unfaithful to every pope since. Neither half coheres with the continuity a Catholic is taught to expect, and a man squaring that circle is pressed toward despair on one side or absurdity on the other. The quarrel is a Roman quarrel, but the reader from another communion will recognize its cousins at home. The four positions below are the four ways of living with the dilemma, weighed as we weighed them, for the paper’s position was not adopted. It was arrived at, after the others failed.</w:t>
-      </w:r>
-    </w:p>
-    <w:p>
-      <w:pPr>
-        <w:pStyle w:val="BodyText"/>
-      </w:pPr>
-      <w:r>
-        <w:t xml:space="preserve">Before the four positions there is a fifth road, older than argument, and we had walked it ourselves. It is the road of coping. The end-times readings, the private revelations, the prophecies of a great monarch and an angelic pope who will restore all things, the counsel to just pray the rosary, find a reverent Mass, and wait out the judgment. And when the mysticism thins, the research begins, deeper and deeper into canons, old catechisms, and rubrics, as though one more archive would make the system cohere. We do not mock any of this. These responses are human, and we made them. But an anesthetic is not an answer, and the question was still there every morning. One of us had spent years telling other men online to submit to Rome, and had to admit at last that he could not himself submit to what Rome teaches today without unsaying what Rome taught then.</w:t>
-      </w:r>
-    </w:p>
-    <w:p>
-      <w:pPr>
-        <w:pStyle w:val="BodyText"/>
-      </w:pPr>
-      <w:r>
-        <w:t xml:space="preserve">The first position says nothing changed, that the Second Vatican Council of the 1960s and the centuries before it teach one seamless thing. We found that this position requires not reading. Set Quanta Cura, the nineteenth century’s solemn condemnation of religious liberty, beside Dignitatis Humanae, the Council’s declaration of it, or set Mortalium Animos, the ban of 1928 on praying with the separated, beside the assemblies every pope since the Council has joined, and the claim of seamlessness does not survive the two pages lying open on one desk.</w:t>
-      </w:r>
-    </w:p>
-    <w:p>
-      <w:pPr>
-        <w:pStyle w:val="BodyText"/>
-      </w:pPr>
-      <w:r>
-        <w:t xml:space="preserve">The second is the reform in continuity of Pope Benedict XVI, that the changes are deep developments of the old faith and not reversals of it, an honorable position from which this paper keeps its tools. But at the collisions themselves it asks the reader to call a reversal a deepening, and we could not say that of the texts above and stay honest. The reversals are real, and some of them were good, which that position cannot say either.</w:t>
-      </w:r>
-    </w:p>
-    <w:p>
-      <w:pPr>
-        <w:pStyle w:val="BodyText"/>
-      </w:pPr>
-      <w:r>
-        <w:t xml:space="preserve">The third holds that the rupture is real and is apostasy, and it comes in two forms. The Society of Saint Pius X professes perfect loyalty to a see it disobeys and denounces. Its own theology needs Rome to be the bedrock that cannot fail, and it declares daily that the bedrock has failed, sawing at the branch it stands on. The sedevacantist, who holds that the recent popes are no popes at all, at least reasons to a conclusion, and the conclusion is that the see of St. Peter has stood empty for two generations and the gates of hell prevailed over the very church whose indefectibility the position exists to defend, an absurdity arrived at by rigor. Both forms share one premise with the first two positions, that the second millennium’s account of Rome is the measure of the faith, so that if Rome reversed it, Rome fell. That premise is the one this paper spent sections 4 and 5 weighing and declining.</w:t>
-      </w:r>
-    </w:p>
-    <w:p>
-      <w:pPr>
-        <w:pStyle w:val="BodyText"/>
-      </w:pPr>
-      <w:r>
-        <w:t xml:space="preserve">And beneath all three sat the true temptation, which was the door. One of us had made his peace with leaving Rome altogether rather than go mad, for a man’s trust in Christ does not hang on the coherence of a Vatican system. What kept us at her altar was not the system. It was the older judgment that Rome remains first among the churches and the strongest gatherer of them, so that whoever hopes for the reunion of Christians has the most reason of all to stay in her and appeal, rather than leave and protest.</w:t>
-      </w:r>
-    </w:p>
-    <w:p>
-      <w:pPr>
-        <w:pStyle w:val="BodyText"/>
-      </w:pPr>
-      <w:r>
-        <w:t xml:space="preserve">The fourth position came to us by tracing. Every man in the traditionalist world keeps a genealogy of the decay, and we kept ours. It came in with the boomers after the second war, or with the French Revolution, or with the Reformation, each rupture blamed on an earlier one, the line running backward century by century. Followed honestly, the line does not stop at 1517 or 1789. It stops at 1054, and there something clicked. The most damaging event in the history of Christendom was not the Council of the 1960s. It was the Great Schism, the tearing of East from West from which so much of the later tearing descends. And the question followed at once, in that same conversation. What if the crisis is not sixty years old but a thousand, and what if the popes called modernist are restoring, however badly, an older shape of the papacy, the church of St. Augustine’s centuries rather than the schoolmen’s? This paper is that question made rigorous. The reversals are real, and where they walked back second-millennium overreach toward the elder faith they were good. We do not claim the hands that made them were always clean, for some walked back overreach with motives that aimed past it, at the deposit itself. But an act is graded by what it did, not by what its makers wanted, and what men meant for evil God may mean for good (Genesis 50:20). What the reversals broke was not the deposit but a theory about who guards it alone. And the fourth position is, in the end, a kindness to Rome, for it offers her what the other three cannot, a way to be honest about her own record. A see that claims her definitions can never be reversed, and reverses, spends her credibility twice with every correction, once because the reversal unsays the claim, and once because the claim makes every correction look like defection. A see that is first among the churches, whose acts await the whole Body’s reception, can correct herself and remain herself, and her word regains the weight the maximal claims have been costing it. Indefectibility belongs to the whole Body, and the faith of the first millennium is the ground the ancient communions still share.</w:t>
-      </w:r>
-    </w:p>
-    <w:p>
-      <w:pPr>
-        <w:pStyle w:val="BodyText"/>
-      </w:pPr>
-      <w:r>
-        <w:t xml:space="preserve">And we should be honest about what first made ecumenism thinkable for us, since it was not a taste for novelty. It was the growing mismatch between what Rome binds and what Rome tolerates. The second millennium laid weight on the faithful century over century, definition upon definition, each new assent made a condition of communion, while the clergy who did the binding increasingly believed and did what they pleased, plain heresy included, and were almost never made to carry anything. Burdens heavy and grievous were bound on the layman’s shoulders by men who would not move them with a finger (Matthew 23:4). A system that anathematizes a layman for questioning an 1870 definition and shrugs at a priest denying the Resurrection has its weights exactly backward. Ecumenism looked to us, from inside that inversion, less like laxity than like realism, the recognition that what actually holds the churches together is the old deposit all of them still confess, not the growing stack of later assents.</w:t>
-      </w:r>
-    </w:p>
-    <w:p>
-      <w:pPr>
-        <w:pStyle w:val="BodyText"/>
-      </w:pPr>
-      <w:r>
-        <w:t xml:space="preserve">One more thought carried us from the verdict to the practice. Rome herself has made ecumenism her official posture. She has entered the assemblies she once forbade, prays beside those she once anathematized, and asks, in the encyclical Ut Unum Sint, for help in rethinking the exercise of her own primacy. If that freedom has been granted, it will be spent on something, and too often it has been spent on indifferentism, the pretense that the divisions do not matter. We resolved to spend it instead on the undivided deposit and the unbroken moral law, an ecumenism toward holiness. That resolution is this paper, and the afterword you are reading is what it looks like on an ordinary Sunday.</w:t>
+        <w:t xml:space="preserve">An open letter on the reception of the disputed definitions, with a proposal.</w:t>
+      </w:r>
+    </w:p>
+    <w:bookmarkStart w:id="117" w:name="to."/>
+    <w:p>
+      <w:pPr>
+        <w:pStyle w:val="Heading4"/>
+      </w:pPr>
+      <w:r>
+        <w:t xml:space="preserve">To.</w:t>
+      </w:r>
+    </w:p>
+    <w:p>
+      <w:pPr>
+        <w:pStyle w:val="FirstParagraph"/>
+      </w:pPr>
+      <w:r>
+        <w:t xml:space="preserve">The Dicastery for Promoting Christian Unity. The Ecumenical Patriarchate and the holy synods of the Orthodox churches. The synods of the Oriental Orthodox churches. The Assyrian Church of the East. The Saint Irenaeus Joint Working Group, the North American Orthodox-Catholic Consultation, and the standing dialogue commissions. The address matches the argument, for the paper that follows holds that all four ancient communions carry the deposit, so all four are addressed.</w:t>
       </w:r>
     </w:p>
     <w:bookmarkEnd w:id="117"/>
-    <w:bookmarkStart w:id="118" w:name="unity-on-paper-and-in-fact"/>
-    <w:p>
-      <w:pPr>
-        <w:pStyle w:val="Heading2"/>
-      </w:pPr>
-      <w:r>
-        <w:t xml:space="preserve">Unity, on paper and in fact</w:t>
-      </w:r>
-    </w:p>
-    <w:p>
-      <w:pPr>
-        <w:pStyle w:val="FirstParagraph"/>
-      </w:pPr>
-      <w:r>
-        <w:t xml:space="preserve">One more honesty from those conversations belongs here, about unity itself. The Roman claim we were raised on is that the system produces two things the divided churches lack, a unity of communion and freedom from private judgment. We looked around and found neither. Within the one canonical communion stand believers who deny each other the name of Christian, parishes that will not imitate each other’s worship, orders that once prayed as one and now would not recognize each other’s theology, all in full communion with the pope and all calling each other heretics. The schisms are real and merely undeclared. And the promise that the system spares a man private judgment fails the same test, for inside that communion he must still judge, which parish, which catechism, which century of papal teaching to weight, and the choosing is private judgment wearing a cassock. The old Protestant critique of Rome’s paper unity is, on the ground, simply true, and honesty concedes it.</w:t>
-      </w:r>
-    </w:p>
-    <w:p>
-      <w:pPr>
-        <w:pStyle w:val="BodyText"/>
-      </w:pPr>
-      <w:r>
-        <w:t xml:space="preserve">But the same ground shows the opposite tearing too. Across the declared schisms stand believers who share the whole creed, the same morals, and the same loves, the traditional Catholic and the confessional Lutheran, the Orthodox and the orthodox Anglican, divided at the altar and united in nearly everything the altar teaches. Undeclared schisms within the communions, undeclared communions across them. Canonical standing and confessed faith have come apart in both directions, and any account of unity that reads only the canon law misses both facts.</w:t>
-      </w:r>
-    </w:p>
-    <w:p>
-      <w:pPr>
-        <w:pStyle w:val="BodyText"/>
-      </w:pPr>
-      <w:r>
-        <w:t xml:space="preserve">This is the paper’s thesis observed from the pew rather than argued from the councils. Unity by act, the roll of who stands in communion with whom, has come apart from unity by confession, who actually holds the faith. The paper’s whole argument is that the second is the real one, that a council binds when the Body confesses it and not when the act is filed. We did not want a polemic against Rome’s unity or anyone else’s. We wanted reality. And the mutual act of section 7 asks nothing else, that the unity which already exists in confession be allowed to become visible at the altar, and that the unity which exists only on paper stop being pretended.</w:t>
-      </w:r>
-    </w:p>
-    <w:bookmarkEnd w:id="118"/>
-    <w:bookmarkStart w:id="119" w:name="X70963d49f6523ed00dc3d0253292b9cc2b47462"/>
-    <w:p>
-      <w:pPr>
-        <w:pStyle w:val="Heading2"/>
-      </w:pPr>
-      <w:r>
-        <w:t xml:space="preserve">The bishop and the presbyter, a question recorded</w:t>
-      </w:r>
-    </w:p>
-    <w:p>
-      <w:pPr>
-        <w:pStyle w:val="FirstParagraph"/>
-      </w:pPr>
-      <w:r>
-        <w:t xml:space="preserve">One question we weigh differently among ourselves, and instead of smoothing the difference over in the body, the afterword gives it the treatment the hard cases get, for it is a live question about the shape of the Church, it excites us, and the reader deserves the record.</w:t>
-      </w:r>
-    </w:p>
-    <w:p>
-      <w:pPr>
-        <w:pStyle w:val="BodyText"/>
-      </w:pPr>
-      <w:r>
-        <w:t xml:space="preserve">The scriptural record first. The New Testament uses bishop and presbyter for the same men. St. Paul summons the presbyters of Ephesus and tells them the Holy Spirit has made them overseers of the flock, episkopoi (Acts 20:17, 28). He greets the bishops and deacons of a single town (Philippians 1:1). He tells Titus to appoint presbyters and gives the qualifications of a bishop in the same breath (Titus 1:5–7). St. Peter writes as a fellow elder to the elders (1 Peter 5:1), and St. John twice opens his letters as the presbyter. Lightfoot, an Anglican bishop and no enemy of his own office, called the identity of the two titles in the New Testament a fact generally recognized by theologians of every shade of opinion.</w:t>
-      </w:r>
-    </w:p>
-    <w:p>
-      <w:pPr>
-        <w:pStyle w:val="BodyText"/>
-      </w:pPr>
-      <w:r>
-        <w:t xml:space="preserve">The earliest witnesses divide. Clement of Rome, writing to Corinth about the year 96, knows bishops and deacons appointed by the apostles, calls the men who hold the bishop’s office presbyters in the same breath, and addresses a Corinth governed by its presbyters, with no single bishop anywhere in the letter. The Didache tells congregations to appoint for themselves bishops and deacons. St. Polycarp writes to Philippi through its presbyters and deacons, names no bishop there, and does not call himself one. Against this stands St. Ignatius of Antioch, traditionally about the year 107, though some recent scholarship dates the letters a generation later, who assumes a single bishop in every Asian church he writes to, Ephesus, Magnesia, Tralles, Smyrna, and urges that nothing be done apart from him. Two details qualify the witness. His letter to Rome, alone of the seven, mentions no bishop at all. And the imagery of his strongest passage runs the other way from the later theory, for in Magnesians the bishop presides after the likeness of God and the presbyters after the likeness of the council of the apostles, so that the imagery of succession from the apostolic college attaches, in the episcopate’s greatest ancient witness, to the presbyterate.</w:t>
-      </w:r>
-    </w:p>
-    <w:p>
-      <w:pPr>
-        <w:pStyle w:val="BodyText"/>
-      </w:pPr>
-      <w:r>
-        <w:t xml:space="preserve">The doctors then say plainly what the record shows. St. Jerome, in the letter to Evangelus, argues from the texts above that the presbyter is the same as the bishop, and that the bishop rose out of the presbyterate as a remedy for schism, the presbyters of Alexandria from St. Mark until Heraclas and Dionysius choosing one of their own number and naming him bishop, as an army makes an emperor. St. John Chrysostom teaches that the presbyters were of old called bishops and the bishops presbyters. And the reading did not die with the Fathers, for the schoolmen debated whether the episcopate is a distinct order at all or the perfection of the one priesthood, and Aquinas in the Supplement took the second view. The first reading’s honest limits are recorded with its strengths. St. Jerome’s Alexandria is election, not consecration, his verbs are chose and named, and the reports of presbyters laying on hands there rest on later and disputed sources. And St. Jerome himself asks what a bishop does that a presbyter does not, excepting ordination, reserving in that clause the very act in question.</w:t>
-      </w:r>
-    </w:p>
-    <w:p>
-      <w:pPr>
-        <w:pStyle w:val="BodyText"/>
-      </w:pPr>
-      <w:r>
-        <w:t xml:space="preserve">The practice record is thin but real. Cassian tells of the desert presbyter Paphnutius who preferred Daniel to the diaconate and promoted him to the priesthood, no bishop appearing in the account, though the verbs can be read as nomination rather than ordination and have been read both ways. Harder to explain away are the popes. In 1400 Boniface IX granted an abbot who was no bishop the power to confer on his canons all orders up to and including the priesthood, and when the grant was revoked three years later on jurisdictional complaint, the ordinations already given were not declared invalid. In 1427 Martin V gave a Cistercian abbot the same power for five years. In 1489 Innocent VIII licensed the abbot of Cîteaux and the four proto-abbots to ordain their monks subdeacons and deacons, a privilege used into the seventeenth century and formally ended only in 1902. These acts stand in the registers and in Denzinger (DH 1145 to 1146, 1290, 1435), and whatever theology explains them, a doctrine on which presbyteral ordination is simply impossible does not.</w:t>
-      </w:r>
-    </w:p>
-    <w:p>
-      <w:pPr>
-        <w:pStyle w:val="BodyText"/>
-      </w:pPr>
-      <w:r>
-        <w:t xml:space="preserve">On these facts one of us reads the episcopate as St. Jerome read it, the ruling presbyterate, an arrangement of the Church’s own wisdom for unity, so that the presbyteral successions of the Reformation are real successions bearing a real defect of order rather than nothing at all. Another of us reads the same facts as John Henry Newman would, the seed of oversight in the apostles and in Timothy and Titus, grown so fast and so universally that within a lifetime of the apostles St. Ignatius can assume it across Asia, which does not happen to innovations, so the episcopate is an authentic development received by the whole Body and kept among this paper’s marks. And the reception case is strong, for whatever the first century was, the threefold order was universal by the end of the second and unanimous until the sixteenth, a reception as deep as any this paper grades. The first reading’s reply is that the wobble sits exactly at the seed, where this paper’s own rules look first, and that what the whole Body received may have been received as the Church’s right ordering rather than as the being of the ministry itself, order and discipline rather than deposit, a distinction the paper already uses when it grades personal anathemas. And the reply carries its own guard, lest it be turned against section 2. What licenses the first reading is counter-witness at the seed, St. Jerome and St. John Chrysostom themselves reading the titles as one, Clement and the Didache and St. Polycarp beside them. On the reservation of orders to men there is no such witness at all, no Father reads the offices as open, and the deaconess canons show the boundary drawn on purpose. A question wobbles at the seed only when the seed’s own doctors wobble, and here they do not.</w:t>
-      </w:r>
-    </w:p>
-    <w:p>
-      <w:pPr>
-        <w:pStyle w:val="BodyText"/>
-      </w:pPr>
-      <w:r>
-        <w:t xml:space="preserve">Pressed as far as it will go, the first reading changes the map without abolishing it. The episcopate remains the received shape of the Church and its recovery is owed everywhere, which is the old Anglican position, Hooker’s, that the government of bishops is the Church’s well-being while presbyteral orders are not therefore null. The five marks then read the episcopate as owed rather than as the boundary of being, the first tier widens to the confessional bodies of presbyteral succession that pass the moral condition and the remaining marks, the receiver gains members, and the mutual act of section 7 grows arms it does not now have. And the two readings are not two roads. They are one road walked at two widths, both defensible and both respectable. The paper’s body walks the narrower width and keeps its focus, the marks and the tiers standing as written on the second reading, while this afterword records the wider walking at full length because it is real, its fathers are St. Jerome and St. John Chrysostom, its registers are papal, and honest men inside this confession weigh it differently and remain brothers.</w:t>
-      </w:r>
-    </w:p>
-    <w:p>
-      <w:pPr>
-        <w:pStyle w:val="BodyText"/>
-      </w:pPr>
-      <w:r>
-        <w:t xml:space="preserve">One line remains, and the wider reading draws it as firmly as the narrower, so it is drawn here where the tier stands widest. The widening reaches the confessional bodies, the churches of the Augsburg Confession and the old Reformed standards, because what they kept is the question’s very subject, an ordered ministry conferred by ordination in succession, the creed confessed, the font given to infants as the whole Church gave it, the Supper a means of grace, the moral law unbroken, though the remaining marks still sort within that reach, for the Supper of the Reformed standards is a means of grace but not the presence Augsburg confesses. It does not reach the fundamentalism and revivalist evangelicalism of the last two centuries, and the reason is not taste but reception. The test of this whole paper is what the whole Body received in its first thousand years, and set beside it the revivalist’s faith and practice appear quite different, not in fervor but in shape. No creed recited, no font for the covenant’s children, no Supper beyond a memorial, no ordered ministry beyond a call answered and a pulpit founded. The confessional Lutheran stands near the first tier because he holds most of what the undivided Church held. The revivalist holds a faith the first millennium would not recognize as its own, sincere, often fervent, sometimes holier than its critics, but not the received thing, and a paper whose one criterion is reception cannot pretend otherwise. The line is not contempt. It is the same line the paper draws everywhere, between what the whole received and what a part devised, and it cuts against the newest devisings exactly as it cuts against Rome’s.</w:t>
-      </w:r>
-    </w:p>
-    <w:p>
-      <w:pPr>
-        <w:pStyle w:val="BodyText"/>
-      </w:pPr>
-      <w:r>
-        <w:t xml:space="preserve">Like every question of its size the wider reading belongs to the reception of the whole Body, and it is submitted there. The Lutheran who holds everything here save the government of bishops should know that the ground he stands on is not nothing. St. Jerome stood near it.</w:t>
-      </w:r>
-    </w:p>
-    <w:bookmarkEnd w:id="119"/>
-    <w:bookmarkStart w:id="120" w:name="if-this-is-true-then"/>
-    <w:p>
-      <w:pPr>
-        <w:pStyle w:val="Heading2"/>
-      </w:pPr>
-      <w:r>
-        <w:t xml:space="preserve">If this is true, then</w:t>
-      </w:r>
-    </w:p>
-    <w:p>
-      <w:pPr>
-        <w:pStyle w:val="FirstParagraph"/>
-      </w:pPr>
-      <w:r>
-        <w:t xml:space="preserve">The paper’s argument has a consequence for the one persuaded by it. To hold this confession as a Roman Catholic is to withhold the assent of faith from definitions Rome holds as</w:t>
-      </w:r>
-      <w:r>
-        <w:t xml:space="preserve"> </w:t>
-      </w:r>
-      <w:r>
-        <w:rPr>
-          <w:i/>
-          <w:iCs/>
-        </w:rPr>
-        <w:t xml:space="preserve">de fide</w:t>
-      </w:r>
-      <w:r>
-        <w:t xml:space="preserve">. Section 3 named that plainly, and no comfort offered here will unsay it. But the one who holds it should understand exactly what he is and is not doing. He is not doubting God, nor the revelation once delivered, nor one article of the faith the undivided Church confessed. The question he suspends is whether certain acts of one see bound the whole Body, and that is a question about an organ’s claim, not about the deposit.</w:t>
-      </w:r>
-    </w:p>
-    <w:p>
-      <w:pPr>
-        <w:pStyle w:val="BodyText"/>
-      </w:pPr>
-      <w:r>
-        <w:t xml:space="preserve">And the plea entered here is not sincerity, for sincerity acquits no heretic. Arius believed Arianism with his whole heart and is a heretic still, since what makes heresy formal is not bad faith but pertinacity, the preference of one’s own judgment against what one knows the Church has given as the rule of faith. The question is therefore what constitutes that rule, and that is this paper’s whole question. Arius stood against a council the whole Body came to confess, and every heretic under the ancient anathemas stood likewise against the received faith of the whole Church, condemned by exactly the criterion this paper stakes. The holder of this confession declines nothing the whole Body has received. He prefers his own judgment to no received faith, only to an act whose claim to bind is the very thing in dispute, and he submits that dispute to the only judge this paper acknowledges, the reception of the whole. By Rome’s present rule he is judged otherwise. So the acquittal offered here rests on the thesis, not on the heart. If this paper’s criterion is true, the holder is no heretic, for he rejects nothing the Church as a whole has given. If it is false, he is wrong with it, and his sincerity will not save him. What can be said beneath the argument is older than the present law. Every Christian of the first millennium held the faith this confession holds, entire, and none of them is condemned for having held no more. A faith sufficient for St. Athanasius, for St. Basil, for St. Augustine, and for St. Maximus is not made damnable by the centuries that followed, and the principle the moralists state runs the same way when read at this paper’s criterion, that a definition binds as heresy only those to whom it has been sufficiently proposed as God’s word, and whether these definitions were ever so proposed to the whole Body is the very thing in dispute.</w:t>
-      </w:r>
-    </w:p>
-    <w:p>
-      <w:pPr>
-        <w:pStyle w:val="BodyText"/>
-      </w:pPr>
-      <w:r>
-        <w:t xml:space="preserve">So the position is dissent, and it is dissent toward catholicity, not away from it, disciplined and principled, not renegade. It binds the one who holds it to more, not less. To stay, and not leave. To pray for the Bishop of Rome by name. To obey in everything the appeal does not touch. To make no faction, recruit no following, and build no parallel magisterium, for an appeal to the whole Body is filed once and then lived quietly. And to bear what follows at the altar without resentment, as section 3 priced it, for the cost is the argument’s seal, not its refutation.</w:t>
-      </w:r>
-    </w:p>
-    <w:p>
-      <w:pPr>
-        <w:pStyle w:val="BodyText"/>
-      </w:pPr>
-      <w:r>
-        <w:t xml:space="preserve">The counsel so far is for the Roman Catholic, because the authors are Roman Catholics and because Rome’s law prices this position most exactly. The others owed a word are owed shorter ones. The Orthodox who is persuaded holds the same faith at the mirror cost, that the Palamite definitions and the claim that Orthodoxy alone is the Church stand not yet received by the whole, and his discipline is the same in his own house. Stay, obey, make no faction, and let the appeal be lived rather than shouted, for his synods too will hear the proposal only from sons who stayed. The high Anglican may hold the whole confession and remain wholly himself, and his burden is not assent but standing, for his orders lie under a doubt only the raiser can heal, as section 6 grades it, and his provinces divide over the very moral consensus this paper stakes. His task is to hold the confession inside a province that holds it too, and to be, where he stands, the proof that the confession can be kept entire. The confessional Lutheran and the Reformed Christian share real planks and cannot subscribe the whole while their standards stand, and nothing here asks them to pretend otherwise. Their part is the witness this paper assigns the whole baptized</w:t>
+    <w:bookmarkStart w:id="118" w:name="communicated-also."/>
+    <w:p>
+      <w:pPr>
+        <w:pStyle w:val="Heading4"/>
+      </w:pPr>
+      <w:r>
+        <w:t xml:space="preserve">Communicated also.</w:t>
+      </w:r>
+    </w:p>
+    <w:p>
+      <w:pPr>
+        <w:pStyle w:val="FirstParagraph"/>
+      </w:pPr>
+      <w:r>
+        <w:t xml:space="preserve">To the churches of the Union of Scranton, whose declaration of 2008 professes nearly what this paper professes, and whose part in the act proposed is therefore not to profess but to be received back, the proposal’s first test case. To the Anglicans of the high and orthodox parishes, whose contested orders this paper grades an open question, healable by the party that raised the doubt, as Rome healed one in 2001. And in brotherhood to the confessional Lutheran and Reformed churches, who hold real planks of this confession and whose witness belongs to the</w:t>
       </w:r>
       <w:r>
         <w:t xml:space="preserve"> </w:t>
@@ -5118,859 +4851,104 @@
         <w:t xml:space="preserve">sensus fidelium</w:t>
       </w:r>
       <w:r>
-        <w:t xml:space="preserve">. Hold the shared planks loudly, the creed, the grace, the moral law, and press their own communions toward the episcopate and the sacraments the first millennium knew, for the trenches of the moral consensus have already taught conservatives across these divides to recognize one another, and that recognition is itself a seed of the reception this paper awaits.</w:t>
-      </w:r>
-    </w:p>
-    <w:p>
-      <w:pPr>
-        <w:pStyle w:val="BodyText"/>
-      </w:pPr>
-      <w:r>
-        <w:t xml:space="preserve">And if this is true, then Tolkien and Lewis, the Roman Catholic and the Anglican who between them taught the last century’s laymen to love the permanent things, are not divided now as they were at every altar on earth, and may well be smoking their pipes side by side in heaven, having a laugh with Luther, who swore he would sooner drink the blood of Christ with the papists than mere wine with the fanatics. And Dostoevsky is there too, the Orthodox among them, who always suspected heaven would be more crowded than the experts allowed. The hope of this confession is not more complicated than that.</w:t>
+        <w:t xml:space="preserve"> </w:t>
+      </w:r>
+      <w:r>
+        <w:t xml:space="preserve">of the whole Body. The mutual act is not theirs to enact, for the professions proposed belong to the synods of the ancient communions. But the paper names these churches, grades their standing, and owes them the courtesy of address rather than report.</w:t>
+      </w:r>
+    </w:p>
+    <w:bookmarkEnd w:id="118"/>
+    <w:bookmarkStart w:id="119" w:name="the-thesis."/>
+    <w:p>
+      <w:pPr>
+        <w:pStyle w:val="Heading4"/>
+      </w:pPr>
+      <w:r>
+        <w:t xml:space="preserve">The thesis.</w:t>
+      </w:r>
+    </w:p>
+    <w:p>
+      <w:pPr>
+        <w:pStyle w:val="FirstParagraph"/>
+      </w:pPr>
+      <w:r>
+        <w:t xml:space="preserve">A council binds when the whole Body receives it, and reception is material, the coming-to-confess of the faith defined, not the formal acceptance of a formula, an assembly, or an act. On that definition the record shows something the standard account misses. The Body has been torn since 251, at Ephesus and Chalcedon it tore again, yet the seven councils stand, and reception across the open tears is attested wherever it has been checked. The church that refused Ephesus confesses, in Babai its doctor and by common declaration of 1994, the one Christ that Ephesus defined. The churches that refused Chalcedon confess, on first-millennium evidence and by the agreed statements since, the faith it guarded. Binding by act alone never existed in the conciliar age. Every council’s authority completed by reception across whatever tears then stood. What division changes is the speed and legibility of the verdict, not its mechanism. It follows that the definitions each communion has made since the great tears, Vatican I and the Marian definitions on the Roman side, the Palamite councils on the Orthodox, stand not yet received by the whole, and not yet rejected, and that no single communion, ours included, can close those questions for the whole by any act of its own.</w:t>
+      </w:r>
+    </w:p>
+    <w:bookmarkEnd w:id="119"/>
+    <w:bookmarkStart w:id="120" w:name="the-proposal."/>
+    <w:p>
+      <w:pPr>
+        <w:pStyle w:val="Heading4"/>
+      </w:pPr>
+      <w:r>
+        <w:t xml:space="preserve">The proposal.</w:t>
+      </w:r>
+    </w:p>
+    <w:p>
+      <w:pPr>
+        <w:pStyle w:val="FirstParagraph"/>
+      </w:pPr>
+      <w:r>
+        <w:t xml:space="preserve">The instrument exists and the Melkite synod of 1995 supplied its genre, a synodal profession, here made mutual and multilateral. Each communion, by the synod competent in it, professes three things. The shared deposit of the councils. That its post-schism definitions are held as its own theological patrimony, taught in its schools and prayed in its liturgies, not imposed on the other communions as conditions of communion. And recognition of the others’ baptism, orders, and eucharist, in force from Rome’s side fully in law, and from the East’s in much though divided practice. Between the Eastern Orthodox and the Oriental churches that recognition is itself the live work of the third profession, so the act stages rather than presumes a single day. Communion follows the professions. No joint definition is asked, for the professions define nothing. They receive. The contested definitions then stand before the reunited Body as proposals of the churches that made them, to ripen or wait as confession spreads or does not. Reception of this proposal is visible and falsifiable, communion restored see by see, names restored to the diptychs, the professions echoed in catechisms across a generation. So is rejection, standing condemnation renewed rather than lapsed.</w:t>
       </w:r>
     </w:p>
     <w:bookmarkEnd w:id="120"/>
-    <w:bookmarkStart w:id="121" w:name="where-one-may-worship"/>
-    <w:p>
-      <w:pPr>
-        <w:pStyle w:val="Heading2"/>
-      </w:pPr>
-      <w:r>
-        <w:t xml:space="preserve">Where one may worship</w:t>
-      </w:r>
-    </w:p>
-    <w:p>
-      <w:pPr>
-        <w:pStyle w:val="FirstParagraph"/>
-      </w:pPr>
-      <w:r>
-        <w:t xml:space="preserve">The roster of the communions, with their standing graded, is the work of section 6, and the counsel for living with it is short. Be rooted, then visit. To commune indiscriminately across communions is spiritually incoherent, and at most altars canonically illicit. Keep one home altar, a parish of the first tier where you are known, confessed, and formed, and visit the others in charity. Where the visited altar is closed, as the Orthodox and most Oriental altars are, visiting is worship and not communing, and the closed altar is borne as part of the division’s cost, not resented. The churches of Scranton preach nearly this confession, hold the first tier by their standing, and one may worship there gladly. Whether to make it home depends on who you are. For us, Roman Catholics whose whole appeal is lodged from within, leaving would forfeit the standing the appeal requires, and section 8 gives that reason in full. For the reader who is not appealing from within Rome, who comes from elsewhere or from a parish that failed him, a church that holds the seven councils, the episcopate, and the undivided faith without the later conditions is not a wrong home. It is the nearest thing to this confession with a roof on it. What it cannot do, being formed by leaving, is show the divided communions the way home, and its members should hold that hope as we hold ours.</w:t>
-      </w:r>
-    </w:p>
-    <w:p>
-      <w:pPr>
-        <w:pStyle w:val="BodyText"/>
-      </w:pPr>
-      <w:r>
-        <w:t xml:space="preserve">The counsel must also meet the harder case, the believer whose nearest parish of his own communion preaches against the faith it exists to hand on. The home altar binds to a communion and its sacraments, not to the nearest building. Parish choice is free, and where a pulpit unsays the creed or the morals of section 2 over your children, the duty is to drive past it, to the Latin Mass, the reverent parish, the sound confessor, at whatever distance the case demands. This is not disloyalty. The precedent is the fourth century, when the faithful under Arian bishops sought orthodox altars across whatever boundaries stood between, and preserved the faith much of the hierarchy was losing, the record on which Newman built his account of the faithful and this paper builds its account of reception.</w:t>
-      </w:r>
-    </w:p>
-    <w:p>
-      <w:pPr>
-        <w:pStyle w:val="BodyText"/>
-      </w:pPr>
-      <w:r>
-        <w:t xml:space="preserve">Where no sound parish of the home communion is in reach, the counsel distinguishes the sermon from the sacrament. A sermon is not a sacrament, and hearing an Augustinian Lutheran or an orthodox Presbyterian preach Christ crucified is better for a household than seating its children under a pulpit that preaches another gospel, for the altar being one’s own does not make the message the faith, and no one owes his ears to heresy out of loyalty to the building it is preached in. But the sacraments do not follow the sermon. The Missouri pulpit may be gold while its altar does not carry the orders the first tier carries, so the Roman Catholic fed by the Lutheran sermon still owes his confession and his communion to a first-tier altar, sought as far away as it must be sought.</w:t>
-      </w:r>
-    </w:p>
-    <w:p>
-      <w:pPr>
-        <w:pStyle w:val="BodyText"/>
-      </w:pPr>
-      <w:r>
-        <w:t xml:space="preserve">The mirror case runs the same way. The Anglican whose bishop his own tradition’s consensus would not recognize may make a reverent Roman parish his refuge and hear the word preached with fidelity and beauty, and his standing question, whether his province still holds what he holds, is the one his counsel above already gave him. The Lutheran whose congregation has been given a shepherd who unsays his own confession has the same freedom, and his first road is the nearest confessional body of his own tradition, for the sound branch usually stands within driving distance of the withered one. Where it does not, a reverent Roman or Orthodox parish will give him the creed entire and the moral law preached without apology, and a sound Presbyterian pulpit will give him the Scriptures opened with reverence, and he should take either over a familiar altar that has left the faith.</w:t>
-      </w:r>
-    </w:p>
-    <w:p>
-      <w:pPr>
-        <w:pStyle w:val="BodyText"/>
-      </w:pPr>
-      <w:r>
-        <w:t xml:space="preserve">The freedom of this paragraph runs in one direction only, toward the deposit. To cross a border to hear the faith preached is fidelity. To stay at a familiar altar and hear another gospel is not rootedness but habit, and to cross for novelty or spectacle is not pilgrimage but tourism. The test in every case is the creed and the consensus of section 2, and the answer to where a man and his children should stand on Sunday is wherever they can hear that faith whole and receive its sacraments validly, and where the two part company, take the sacraments from the first tier and the preaching from wherever God has left it sound.</w:t>
-      </w:r>
-    </w:p>
-    <w:p>
-      <w:pPr>
-        <w:pStyle w:val="BodyText"/>
-      </w:pPr>
-      <w:r>
-        <w:t xml:space="preserve">One asymmetry deserves naming here, for it explains two generations of loss. When liberalism came to the Reformation churches, they could prune. The confessional bodies split from the mainlines and stood, Missouri beside the body it left, the orthodox Presbyterians beside theirs, the continuing Anglicans beside theirs, so the Protestant believer whose pulpit fell had a refuge inside his own tradition and a road to it. When the same liberalism came to the Catholic parishes it came inside a single structure, with no parallel body to receive the sheep. So the Catholic whose parish failed him too often concluded that the faith itself had failed him, and left, not for another altar but for none. That apostasy is part of the price of not knowing the map this paper draws, that the deposit is carried, whole or in planks, at more altars and pulpits than one’s own. The ecumenism this confession commends is not a diplomatic courtesy. For the sheep of a failing parish it is a map of refuges, and the grace of knowing it is the difference between a believer who drives further and a believer who stops believing.</w:t>
+    <w:bookmarkStart w:id="121" w:name="what-this-asks-and-its-price."/>
+    <w:p>
+      <w:pPr>
+        <w:pStyle w:val="Heading4"/>
+      </w:pPr>
+      <w:r>
+        <w:t xml:space="preserve">What this asks, and its price.</w:t>
+      </w:r>
+    </w:p>
+    <w:p>
+      <w:pPr>
+        <w:pStyle w:val="FirstParagraph"/>
+      </w:pPr>
+      <w:r>
+        <w:t xml:space="preserve">No church is asked to renounce the content of what it teaches. Rome is not asked to unsay what 1870 defined, nor the Orthodox what 1351 defined. Each is asked to cease requiring of the whole what the whole has not confessed, which the paper argues is all the first millennium itself ever required. For Rome the asking is a real reversal of practice and of self-understanding, for Pastor Aeternus claims a binding force owing nothing to the Church’s consent, and to hold that definition as patrimony rather than exact it as a condition is to walk part of the way back toward the first millennium. Section 4 prices this collision. It argues only that the walk is of a kind Rome has already made where the second millennium overreached, at Florence’s rigor on the unbaptized, at the coercion of conscience, at the ban on praying with the separated, and made well. What is asked is not the surrender of a possession but the retirement of a claim to one. And the retirement returns more than it costs. A see that may not be corrected spends her credibility with every correction she in fact makes. A see whose acts await the whole Body’s reception can correct herself and remain herself. The Orthodox are asked the mirror price, that the identification of the whole Church with themselves be held no longer as a condition. And the authors pay a price of their own. We are Roman Catholics, and by Rome’s present law this position is public material dissent, which we do not claim she permits. We hold it as an appeal to a reception the whole Body has not yet given, and we stand at her altar bearing what follows. The end sought is not architectural tidiness. It is the Lord’s own prayer, that they may all be one, as the Father and the Son are one, so that the world may believe (John 17:21). The paper is an argument that this road is the one the record leaves open.</w:t>
       </w:r>
     </w:p>
     <w:bookmarkEnd w:id="121"/>
-    <w:bookmarkStart w:id="122" w:name="a-rule-of-prayer-at-home"/>
-    <w:p>
-      <w:pPr>
-        <w:pStyle w:val="Heading2"/>
-      </w:pPr>
-      <w:r>
-        <w:t xml:space="preserve">A rule of prayer at home</w:t>
-      </w:r>
-    </w:p>
-    <w:p>
-      <w:pPr>
-        <w:pStyle w:val="FirstParagraph"/>
-      </w:pPr>
-      <w:r>
-        <w:t xml:space="preserve">The position implies a pattern of devotion that is first-millennial, shared between East and West, and ordinary.</w:t>
-      </w:r>
-    </w:p>
-    <w:p>
-      <w:pPr>
-        <w:numPr>
-          <w:ilvl w:val="0"/>
-          <w:numId w:val="1001"/>
-        </w:numPr>
-      </w:pPr>
-      <w:r>
-        <w:rPr>
-          <w:b/>
-          <w:bCs/>
-        </w:rPr>
-        <w:t xml:space="preserve">The Altar, weekly and more.</w:t>
-      </w:r>
-      <w:r>
-        <w:t xml:space="preserve"> </w:t>
-      </w:r>
-      <w:r>
-        <w:t xml:space="preserve">The Mass or Divine Liturgy is the center of the week, and the rest of the rule follows from it.</w:t>
-      </w:r>
-    </w:p>
-    <w:p>
-      <w:pPr>
-        <w:numPr>
-          <w:ilvl w:val="0"/>
-          <w:numId w:val="1001"/>
-        </w:numPr>
-      </w:pPr>
-      <w:r>
-        <w:rPr>
-          <w:b/>
-          <w:bCs/>
-        </w:rPr>
-        <w:t xml:space="preserve">The Hours.</w:t>
-      </w:r>
-      <w:r>
-        <w:t xml:space="preserve"> </w:t>
-      </w:r>
-      <w:r>
-        <w:t xml:space="preserve">The Divine Office in any of its forms, the Monastic Diurnal, the older Breviary, or the Liturgy of the Hours. The daily Psalter is the first-millennium layman’s foundation.</w:t>
-      </w:r>
-    </w:p>
-    <w:p>
-      <w:pPr>
-        <w:numPr>
-          <w:ilvl w:val="0"/>
-          <w:numId w:val="1001"/>
-        </w:numPr>
-      </w:pPr>
-      <w:r>
-        <w:rPr>
-          <w:b/>
-          <w:bCs/>
-        </w:rPr>
-        <w:t xml:space="preserve">The Jesus Prayer.</w:t>
-      </w:r>
-      <w:r>
-        <w:t xml:space="preserve"> </w:t>
-      </w:r>
-      <w:r>
-        <w:t xml:space="preserve">Lord Jesus Christ, Son of God, have mercy on me. The shared contemplative tradition of East and West, taken up with the</w:t>
-      </w:r>
-      <w:r>
-        <w:t xml:space="preserve"> </w:t>
-      </w:r>
-      <w:r>
-        <w:rPr>
-          <w:i/>
-          <w:iCs/>
-        </w:rPr>
-        <w:t xml:space="preserve">Philokalia</w:t>
-      </w:r>
-      <w:r>
-        <w:t xml:space="preserve"> </w:t>
-      </w:r>
-      <w:r>
-        <w:t xml:space="preserve">and</w:t>
-      </w:r>
-      <w:r>
-        <w:t xml:space="preserve"> </w:t>
-      </w:r>
-      <w:r>
-        <w:rPr>
-          <w:i/>
-          <w:iCs/>
-        </w:rPr>
-        <w:t xml:space="preserve">The Way of a Pilgrim</w:t>
-      </w:r>
-      <w:r>
-        <w:t xml:space="preserve">.</w:t>
-      </w:r>
-    </w:p>
-    <w:p>
-      <w:pPr>
-        <w:numPr>
-          <w:ilvl w:val="0"/>
-          <w:numId w:val="1001"/>
-        </w:numPr>
-      </w:pPr>
-      <w:r>
-        <w:rPr>
-          <w:b/>
-          <w:bCs/>
-        </w:rPr>
-        <w:t xml:space="preserve">Lectio divina.</w:t>
-      </w:r>
-      <w:r>
-        <w:t xml:space="preserve"> </w:t>
-      </w:r>
-      <w:r>
-        <w:t xml:space="preserve">Scripture read slowly and prayerfully, with the Fathers as guides.</w:t>
-      </w:r>
-    </w:p>
-    <w:p>
-      <w:pPr>
-        <w:numPr>
-          <w:ilvl w:val="0"/>
-          <w:numId w:val="1001"/>
-        </w:numPr>
-      </w:pPr>
-      <w:r>
-        <w:rPr>
-          <w:b/>
-          <w:bCs/>
-        </w:rPr>
-        <w:t xml:space="preserve">Confession and fasting.</w:t>
-      </w:r>
-      <w:r>
-        <w:t xml:space="preserve"> </w:t>
-      </w:r>
-      <w:r>
-        <w:t xml:space="preserve">Regular penance, and the Ember days, Lent, and the ancient fasts.</w:t>
-      </w:r>
-    </w:p>
-    <w:p>
-      <w:pPr>
-        <w:numPr>
-          <w:ilvl w:val="0"/>
-          <w:numId w:val="1001"/>
-        </w:numPr>
-      </w:pPr>
-      <w:r>
-        <w:rPr>
-          <w:b/>
-          <w:bCs/>
-        </w:rPr>
-        <w:t xml:space="preserve">The Mother of God.</w:t>
-      </w:r>
-      <w:r>
-        <w:t xml:space="preserve"> </w:t>
-      </w:r>
-      <w:r>
-        <w:t xml:space="preserve">The Rosary in the West and the Akathist in the East, Marian devotion in the key of the Councils, that is, the Theotokos.</w:t>
-      </w:r>
-    </w:p>
-    <w:p>
-      <w:pPr>
-        <w:numPr>
-          <w:ilvl w:val="0"/>
-          <w:numId w:val="1001"/>
-        </w:numPr>
-      </w:pPr>
-      <w:r>
-        <w:rPr>
-          <w:b/>
-          <w:bCs/>
-        </w:rPr>
-        <w:t xml:space="preserve">A rule and a rhythm.</w:t>
-      </w:r>
-      <w:r>
-        <w:t xml:space="preserve"> </w:t>
-      </w:r>
-      <w:r>
-        <w:t xml:space="preserve">The Rule of St. Benedict and the life of an oblate, stability, the Office, and</w:t>
-      </w:r>
-      <w:r>
-        <w:t xml:space="preserve"> </w:t>
-      </w:r>
-      <w:r>
-        <w:rPr>
-          <w:i/>
-          <w:iCs/>
-        </w:rPr>
-        <w:t xml:space="preserve">lectio</w:t>
-      </w:r>
-      <w:r>
-        <w:t xml:space="preserve">, pre-schism and revered East and West, well suited to a layman seeking a first-millennium pattern of life.</w:t>
+    <w:bookmarkStart w:id="122" w:name="the-standing-invitation."/>
+    <w:p>
+      <w:pPr>
+        <w:pStyle w:val="Heading4"/>
+      </w:pPr>
+      <w:r>
+        <w:t xml:space="preserve">The standing invitation.</w:t>
+      </w:r>
+    </w:p>
+    <w:p>
+      <w:pPr>
+        <w:pStyle w:val="FirstParagraph"/>
+      </w:pPr>
+      <w:r>
+        <w:t xml:space="preserve">John Paul II asked in Ut Unum Sint, sections 95 and 96, for help in finding a way of exercising the primacy open to a new situation, and The Bishop of Rome of 2024 gathered the answers to that invitation. The proposal above is tendered as part of that solicited contribution, for it concerns the exercise. The invitation does not cover the definitions themselves, and we do not pretend it does.</w:t>
       </w:r>
     </w:p>
     <w:bookmarkEnd w:id="122"/>
-    <w:bookmarkStart w:id="126" w:name="a-catechism-of-the-first-millennium"/>
-    <w:p>
-      <w:pPr>
-        <w:pStyle w:val="Heading2"/>
-      </w:pPr>
-      <w:r>
-        <w:t xml:space="preserve">A catechism of the first millennium</w:t>
-      </w:r>
-    </w:p>
-    <w:p>
-      <w:pPr>
-        <w:pStyle w:val="FirstParagraph"/>
-      </w:pPr>
-      <w:r>
-        <w:t xml:space="preserve">The reader who wants the faith of the undivided Church taught whole, in one voice and from inside, should have a catechism of that Church rather than a modern digest, and one exists. The Catechetical Lectures of St. Cyril of Jerusalem, delivered about the year 350 to the candidates for baptism in the church of the Holy Sepulchre, teach the creed article by article and then, in the mystagogical lectures, the sacraments the newly baptized had just received, baptism, chrismation, and the eucharist. They are pre-schism, honored in East and West alike, addressed to laymen, and complete. St. Gregory of Nyssa’s Catechetical Oration, printed in English as the Great Catechism, serves the teacher as St. Cyril serves the catechumen, and St. Augustine’s Enchiridion, on faith, hope, and love, is the Western pocket manual of the same age. All three stand in the standard nineteenth-century translations, Cyril in the Nicene and Post-Nicene Fathers, second series, volume 7, Gregory in the same series, volume 5, and the Enchiridion in the first series, volume 3, and online, Cyril at</w:t>
-      </w:r>
-      <w:r>
-        <w:t xml:space="preserve"> </w:t>
-      </w:r>
-      <w:hyperlink r:id="rId123">
-        <w:r>
-          <w:rPr>
-            <w:rStyle w:val="Hyperlink"/>
-          </w:rPr>
-          <w:t xml:space="preserve">https://ccel.org/ccel/schaff/npnf207/npnf207.ii.i.html</w:t>
-        </w:r>
-      </w:hyperlink>
-      <w:r>
-        <w:t xml:space="preserve">, Gregory at</w:t>
-      </w:r>
-      <w:r>
-        <w:t xml:space="preserve"> </w:t>
-      </w:r>
-      <w:hyperlink r:id="rId124">
-        <w:r>
-          <w:rPr>
-            <w:rStyle w:val="Hyperlink"/>
-          </w:rPr>
-          <w:t xml:space="preserve">https://ccel.org/ccel/schaff/npnf205/npnf205.xi.ii.i.html</w:t>
-        </w:r>
-      </w:hyperlink>
-      <w:r>
-        <w:t xml:space="preserve">, and Augustine at</w:t>
-      </w:r>
-      <w:r>
-        <w:t xml:space="preserve"> </w:t>
-      </w:r>
-      <w:hyperlink r:id="rId125">
-        <w:r>
-          <w:rPr>
-            <w:rStyle w:val="Hyperlink"/>
-          </w:rPr>
-          <w:t xml:space="preserve">https://ccel.org/ccel/augustine/enchiridion/enchiridion.i.html</w:t>
-        </w:r>
-      </w:hyperlink>
-      <w:r>
-        <w:t xml:space="preserve">.</w:t>
-      </w:r>
-    </w:p>
-    <w:bookmarkEnd w:id="126"/>
-    <w:bookmarkStart w:id="130" w:name="recommended-reading"/>
-    <w:p>
-      <w:pPr>
-        <w:pStyle w:val="Heading2"/>
-      </w:pPr>
-      <w:r>
-        <w:t xml:space="preserve">Recommended reading</w:t>
-      </w:r>
-    </w:p>
-    <w:bookmarkStart w:id="127" w:name="the-criterion-and-the-method."/>
-    <w:p>
-      <w:pPr>
-        <w:pStyle w:val="Heading4"/>
-      </w:pPr>
-      <w:r>
-        <w:t xml:space="preserve">The criterion and the method.</w:t>
-      </w:r>
-    </w:p>
-    <w:p>
-      <w:pPr>
-        <w:numPr>
-          <w:ilvl w:val="0"/>
-          <w:numId w:val="1002"/>
-        </w:numPr>
-      </w:pPr>
-      <w:r>
-        <w:rPr>
-          <w:i/>
-          <w:iCs/>
-        </w:rPr>
-        <w:t xml:space="preserve">The Commonitory</w:t>
-      </w:r>
-      <w:r>
-        <w:t xml:space="preserve">, by Vincent of Lérins. The canon of section 1, what has been believed everywhere, always, and by all, in its original argument. The whole paper is one long application of it under the material-reception definition, so the reader should have the source in hand.</w:t>
-      </w:r>
-    </w:p>
-    <w:p>
-      <w:pPr>
-        <w:numPr>
-          <w:ilvl w:val="0"/>
-          <w:numId w:val="1002"/>
-        </w:numPr>
-      </w:pPr>
-      <w:r>
-        <w:rPr>
-          <w:i/>
-          <w:iCs/>
-        </w:rPr>
-        <w:t xml:space="preserve">An Essay on the Development of Christian Doctrine</w:t>
-      </w:r>
-      <w:r>
-        <w:t xml:space="preserve">, by John Henry Newman. The three conditions of section 5 are cut from Newman’s tools, and section 4 answers his argument for a living judge. Read to test the paper’s claim that it keeps his method while declining his conclusion.</w:t>
-      </w:r>
-    </w:p>
-    <w:p>
-      <w:pPr>
-        <w:numPr>
-          <w:ilvl w:val="0"/>
-          <w:numId w:val="1002"/>
-        </w:numPr>
-      </w:pPr>
-      <w:r>
-        <w:rPr>
-          <w:i/>
-          <w:iCs/>
-        </w:rPr>
-        <w:t xml:space="preserve">On Consulting the Faithful in Matters of Doctrine</w:t>
-      </w:r>
-      <w:r>
-        <w:t xml:space="preserve">, by John Henry Newman. The record of the Arian century, when the body of the faithful preserved what many bishops lost, the account behind this paper’s receiver and witness and behind the afterword’s counsel for the failing parish.</w:t>
-      </w:r>
-    </w:p>
-    <w:p>
-      <w:pPr>
-        <w:numPr>
-          <w:ilvl w:val="0"/>
-          <w:numId w:val="1002"/>
-        </w:numPr>
-      </w:pPr>
-      <w:r>
-        <w:rPr>
-          <w:i/>
-          <w:iCs/>
-        </w:rPr>
-        <w:t xml:space="preserve">Summa Theologiae</w:t>
-      </w:r>
-      <w:r>
-        <w:t xml:space="preserve">, the Treatise on Law (I-II, qq. 90–108), by Thomas Aquinas. The ground of the second witness of section 5, with the division of the Law at q. 99 and the cessation of its judicial precepts at q. 104, on which the death penalty case of appendix B turns.</w:t>
-      </w:r>
-    </w:p>
-    <w:p>
-      <w:pPr>
-        <w:numPr>
-          <w:ilvl w:val="0"/>
-          <w:numId w:val="1002"/>
-        </w:numPr>
-      </w:pPr>
-      <w:r>
-        <w:rPr>
-          <w:i/>
-          <w:iCs/>
-        </w:rPr>
-        <w:t xml:space="preserve">Mere Christianity</w:t>
-      </w:r>
-      <w:r>
-        <w:t xml:space="preserve">, by C. S. Lewis. The source of the word merely as the title uses it, a core held whole without the later conditions of any one communion.</w:t>
-      </w:r>
-    </w:p>
-    <w:bookmarkEnd w:id="127"/>
-    <w:bookmarkStart w:id="128" w:name="X8c03ab749d205a373bd0a985f7d781e9fa691df"/>
-    <w:p>
-      <w:pPr>
-        <w:pStyle w:val="Heading4"/>
-      </w:pPr>
-      <w:r>
-        <w:t xml:space="preserve">The primacy and the schism, both roads in their own voices.</w:t>
-      </w:r>
-    </w:p>
-    <w:p>
-      <w:pPr>
-        <w:numPr>
-          <w:ilvl w:val="0"/>
-          <w:numId w:val="1003"/>
-        </w:numPr>
-      </w:pPr>
-      <w:r>
-        <w:rPr>
-          <w:i/>
-          <w:iCs/>
-        </w:rPr>
-        <w:t xml:space="preserve">Principles of Catholic Theology</w:t>
-      </w:r>
-      <w:r>
-        <w:t xml:space="preserve">, with</w:t>
-      </w:r>
-      <w:r>
-        <w:t xml:space="preserve"> </w:t>
-      </w:r>
-      <w:r>
-        <w:rPr>
-          <w:i/>
-          <w:iCs/>
-        </w:rPr>
-        <w:t xml:space="preserve">Called to Communion</w:t>
-      </w:r>
-      <w:r>
-        <w:t xml:space="preserve">, by Joseph Ratzinger. The source of the formula section 8 quotes, that Rome must not require more from the East with respect to the primacy than was formulated and lived in the first millennium, the nearest Roman sentence to this paper’s thesis.</w:t>
-      </w:r>
-    </w:p>
-    <w:p>
-      <w:pPr>
-        <w:numPr>
-          <w:ilvl w:val="0"/>
-          <w:numId w:val="1003"/>
-        </w:numPr>
-      </w:pPr>
-      <w:r>
-        <w:rPr>
-          <w:i/>
-          <w:iCs/>
-        </w:rPr>
-        <w:t xml:space="preserve">Papal Primacy</w:t>
-      </w:r>
-      <w:r>
-        <w:t xml:space="preserve">, by Klaus Schatz. The standard historical account of the primacy’s growth, by a Catholic historian. Section 4’s weighing of Sardica, the appeals, and Honorius can be checked against it.</w:t>
-      </w:r>
-    </w:p>
-    <w:p>
-      <w:pPr>
-        <w:numPr>
-          <w:ilvl w:val="0"/>
-          <w:numId w:val="1003"/>
-        </w:numPr>
-      </w:pPr>
-      <w:r>
-        <w:rPr>
-          <w:i/>
-          <w:iCs/>
-        </w:rPr>
-        <w:t xml:space="preserve">After Nine Hundred Years</w:t>
-      </w:r>
-      <w:r>
-        <w:t xml:space="preserve"> </w:t>
-      </w:r>
-      <w:r>
-        <w:t xml:space="preserve">and</w:t>
-      </w:r>
-      <w:r>
-        <w:t xml:space="preserve"> </w:t>
-      </w:r>
-      <w:r>
-        <w:rPr>
-          <w:i/>
-          <w:iCs/>
-        </w:rPr>
-        <w:t xml:space="preserve">Diversity and Communion</w:t>
-      </w:r>
-      <w:r>
-        <w:t xml:space="preserve">, by Yves Congar. The diagnosis of the schism’s non-doctrinal causes and the case that unity does not require uniformity, the ressourcement lineage section 8 claims.</w:t>
-      </w:r>
-    </w:p>
-    <w:p>
-      <w:pPr>
-        <w:numPr>
-          <w:ilvl w:val="0"/>
-          <w:numId w:val="1003"/>
-        </w:numPr>
-      </w:pPr>
-      <w:r>
-        <w:rPr>
-          <w:i/>
-          <w:iCs/>
-        </w:rPr>
-        <w:t xml:space="preserve">Orthodoxy and the Roman Papacy</w:t>
-      </w:r>
-      <w:r>
-        <w:t xml:space="preserve">, by Adam A. J. DeVille. A contemporary proposal for reforming the papacy on first-millennium lines, the nearest published cousin to the mutual act of section 7.</w:t>
-      </w:r>
-    </w:p>
-    <w:p>
-      <w:pPr>
-        <w:numPr>
-          <w:ilvl w:val="0"/>
-          <w:numId w:val="1003"/>
-        </w:numPr>
-      </w:pPr>
-      <w:r>
-        <w:rPr>
-          <w:i/>
-          <w:iCs/>
-        </w:rPr>
-        <w:t xml:space="preserve">The Ravenna and Chieti Documents</w:t>
-      </w:r>
-      <w:r>
-        <w:t xml:space="preserve">, with</w:t>
-      </w:r>
-      <w:r>
-        <w:t xml:space="preserve"> </w:t>
-      </w:r>
-      <w:r>
-        <w:rPr>
-          <w:i/>
-          <w:iCs/>
-        </w:rPr>
-        <w:t xml:space="preserve">The Bishop of Rome</w:t>
-      </w:r>
-      <w:r>
-        <w:t xml:space="preserve"> </w:t>
-      </w:r>
-      <w:r>
-        <w:t xml:space="preserve">(2024). The dialogue’s agreed statements on primacy and synodality in the first millennium, cited as evidence in section 4, and Rome’s own gathering of the whole question. The 2024 study’s warning that the first millennium must not be idealized nor simply recreated is the sharpest rebuke in print to this paper’s method, and it is commended for exactly that reason.</w:t>
-      </w:r>
-    </w:p>
-    <w:p>
-      <w:pPr>
-        <w:numPr>
-          <w:ilvl w:val="0"/>
-          <w:numId w:val="1003"/>
-        </w:numPr>
-      </w:pPr>
-      <w:r>
-        <w:rPr>
-          <w:i/>
-          <w:iCs/>
-        </w:rPr>
-        <w:t xml:space="preserve">Being as Communion</w:t>
-      </w:r>
-      <w:r>
-        <w:t xml:space="preserve">, by John Zizioulas. The eucharistic ecclesiology named in section 8’s lineage, whose own logic section 4 turns against the Orthodox exclusivist conclusion.</w:t>
-      </w:r>
-    </w:p>
-    <w:p>
-      <w:pPr>
-        <w:numPr>
-          <w:ilvl w:val="0"/>
-          <w:numId w:val="1003"/>
-        </w:numPr>
-      </w:pPr>
-      <w:r>
-        <w:rPr>
-          <w:i/>
-          <w:iCs/>
-        </w:rPr>
-        <w:t xml:space="preserve">The Papacy: Revisiting the Debate between Catholics and Orthodox</w:t>
-      </w:r>
-      <w:r>
-        <w:t xml:space="preserve">, by Erick Ybarra. The maximalist case at full strength, so that the road this paper declines is read from its best advocate and not through its critics.</w:t>
-      </w:r>
-    </w:p>
-    <w:p>
-      <w:pPr>
-        <w:numPr>
-          <w:ilvl w:val="0"/>
-          <w:numId w:val="1003"/>
-        </w:numPr>
-      </w:pPr>
-      <w:r>
-        <w:rPr>
-          <w:i/>
-          <w:iCs/>
-        </w:rPr>
-        <w:t xml:space="preserve">The Encyclical of the Eastern Patriarchs</w:t>
-      </w:r>
-      <w:r>
-        <w:t xml:space="preserve"> </w:t>
-      </w:r>
-      <w:r>
-        <w:t xml:space="preserve">(1848). The rigorist Orthodox reply to Rome. Section 4 declines its exclusivism on the merits, and owes the reader the original.</w:t>
-      </w:r>
-    </w:p>
-    <w:p>
-      <w:pPr>
-        <w:numPr>
-          <w:ilvl w:val="0"/>
-          <w:numId w:val="1003"/>
-        </w:numPr>
-      </w:pPr>
-      <w:r>
-        <w:rPr>
-          <w:i/>
-          <w:iCs/>
-        </w:rPr>
-        <w:t xml:space="preserve">The Declaration of Scranton</w:t>
-      </w:r>
-      <w:r>
-        <w:t xml:space="preserve"> </w:t>
-      </w:r>
-      <w:r>
-        <w:t xml:space="preserve">(2008), of the Union of Scranton. The nearest institutional embodiment of this confession, professed in separation, weighed in sections 6 and 8.</w:t>
-      </w:r>
-    </w:p>
-    <w:p>
-      <w:pPr>
-        <w:numPr>
-          <w:ilvl w:val="0"/>
-          <w:numId w:val="1003"/>
-        </w:numPr>
-      </w:pPr>
-      <w:r>
-        <w:rPr>
-          <w:i/>
-          <w:iCs/>
-        </w:rPr>
-        <w:t xml:space="preserve">On Baptism, against the Donatists</w:t>
-      </w:r>
-      <w:r>
-        <w:t xml:space="preserve">, by Augustine. The undivided Church’s articulate refusal of the strict Cyprianic boundary, on which section 4’s answer to the Orthodox exclusivist claim leans.</w:t>
-      </w:r>
-    </w:p>
-    <w:bookmarkEnd w:id="128"/>
-    <w:bookmarkStart w:id="129" w:name="X0576e1c1e07b6b7fcb7431b969e543fb6f37217"/>
-    <w:p>
-      <w:pPr>
-        <w:pStyle w:val="Heading4"/>
-      </w:pPr>
-      <w:r>
-        <w:t xml:space="preserve">The hard cases, and the hope held as hope.</w:t>
-      </w:r>
-    </w:p>
-    <w:p>
-      <w:pPr>
-        <w:numPr>
-          <w:ilvl w:val="0"/>
-          <w:numId w:val="1004"/>
-        </w:numPr>
-      </w:pPr>
-      <w:r>
-        <w:rPr>
-          <w:i/>
-          <w:iCs/>
-        </w:rPr>
-        <w:t xml:space="preserve">By Man Shall His Blood Be Shed</w:t>
-      </w:r>
-      <w:r>
-        <w:t xml:space="preserve">, by Edward Feser and Joseph Bessette. The full argument that the right of the sword is irreformable teaching, from authors who signed the scholars’ appeal of 2018 that the death penalty case cites. The case reaches their conclusion by this paper’s own rules, and the reader should see the longer road.</w:t>
-      </w:r>
-    </w:p>
-    <w:p>
-      <w:pPr>
-        <w:numPr>
-          <w:ilvl w:val="0"/>
-          <w:numId w:val="1004"/>
-        </w:numPr>
-      </w:pPr>
-      <w:r>
-        <w:rPr>
-          <w:i/>
-          <w:iCs/>
-        </w:rPr>
-        <w:t xml:space="preserve">Religious Liberty Questioned</w:t>
-      </w:r>
-      <w:r>
-        <w:t xml:space="preserve">, by Marcel Lefebvre. The Society’s case that Dignitatis Humanae contradicts Quanta Cura, granted on the reading of the texts and answered on the criterion in the religious liberty case. The paper argues with this book and should be checked against it.</w:t>
-      </w:r>
-    </w:p>
-    <w:p>
-      <w:pPr>
-        <w:numPr>
-          <w:ilvl w:val="0"/>
-          <w:numId w:val="1004"/>
-        </w:numPr>
-      </w:pPr>
-      <w:r>
-        <w:rPr>
-          <w:i/>
-          <w:iCs/>
-        </w:rPr>
-        <w:t xml:space="preserve">The Joint Declaration on the Doctrine of Justification</w:t>
-      </w:r>
-      <w:r>
-        <w:t xml:space="preserve"> </w:t>
-      </w:r>
-      <w:r>
-        <w:t xml:space="preserve">(1999), of the Catholic Church and the Lutheran World Federation. The agreement section 3 weighs, that many of Trent’s condemnations no longer strike the Lutheran position as there clarified, read here as corroboration and not closure, the same grade this paper gives every modern agreement.</w:t>
-      </w:r>
-    </w:p>
-    <w:p>
-      <w:pPr>
-        <w:numPr>
-          <w:ilvl w:val="0"/>
-          <w:numId w:val="1004"/>
-        </w:numPr>
-      </w:pPr>
-      <w:r>
-        <w:rPr>
-          <w:i/>
-          <w:iCs/>
-        </w:rPr>
-        <w:t xml:space="preserve">The Ascetical Homilies</w:t>
-      </w:r>
-      <w:r>
-        <w:t xml:space="preserve">, by Isaac the Syrian, and</w:t>
-      </w:r>
-      <w:r>
-        <w:t xml:space="preserve"> </w:t>
-      </w:r>
-      <w:r>
-        <w:rPr>
-          <w:i/>
-          <w:iCs/>
-        </w:rPr>
-        <w:t xml:space="preserve">On the Soul and the Resurrection</w:t>
-      </w:r>
-      <w:r>
-        <w:t xml:space="preserve">, by Gregory of Nyssa. The Fathers of mercy that section 2 points to, the first-millennium root of the hope held there as hope and not as dogma.</w:t>
-      </w:r>
-    </w:p>
-    <w:p>
-      <w:pPr>
-        <w:numPr>
-          <w:ilvl w:val="0"/>
-          <w:numId w:val="1004"/>
-        </w:numPr>
-      </w:pPr>
-      <w:r>
-        <w:rPr>
-          <w:i/>
-          <w:iCs/>
-        </w:rPr>
-        <w:t xml:space="preserve">Dare We Hope</w:t>
-      </w:r>
-      <w:r>
-        <w:rPr>
-          <w:i/>
-          <w:iCs/>
-        </w:rPr>
-        <w:t xml:space="preserve"> </w:t>
-      </w:r>
-      <w:r>
-        <w:rPr>
-          <w:i/>
-          <w:iCs/>
-        </w:rPr>
-        <w:t xml:space="preserve">“That All Men Be Saved”</w:t>
-      </w:r>
-      <w:r>
-        <w:rPr>
-          <w:i/>
-          <w:iCs/>
-        </w:rPr>
-        <w:t xml:space="preserve">?</w:t>
-      </w:r>
-      <w:r>
-        <w:t xml:space="preserve">, by Hans Urs von Balthasar, with the essay</w:t>
-      </w:r>
-      <w:r>
-        <w:t xml:space="preserve"> </w:t>
-      </w:r>
-      <w:r>
-        <w:t xml:space="preserve">“Dare We Hope for the Salvation of All?”</w:t>
-      </w:r>
-      <w:r>
-        <w:t xml:space="preserve">, by Kallistos Ware. The same hope stated in West and East, at the grade section 2 assigns it, held as hope, not asserted.</w:t>
-      </w:r>
-    </w:p>
-    <w:bookmarkEnd w:id="129"/>
-    <w:bookmarkEnd w:id="130"/>
-    <w:bookmarkStart w:id="131" w:name="what-a-confession-can-do"/>
-    <w:p>
-      <w:pPr>
-        <w:pStyle w:val="Heading2"/>
-      </w:pPr>
-      <w:r>
-        <w:t xml:space="preserve">What a confession can do</w:t>
-      </w:r>
-    </w:p>
-    <w:p>
-      <w:pPr>
-        <w:pStyle w:val="FirstParagraph"/>
-      </w:pPr>
-      <w:r>
-        <w:t xml:space="preserve">The reader may ask what a paper like this can accomplish, written by laymen, addressed to synods that receive many papers and answer few. The honest answer is the paper’s own doctrine. Nothing binds by act, and nothing changes the Church by act either, not a definition, not a schism, and not a working paper. Definition ripens where it is confessed, and so does everything else. The ideas that moved the Church in the last two centuries were carried first by men with no chair and no standing. Khomiakov was a retired cavalry officer whose essays on the Church could not be published in his own country, and his account of an infallibility residing in the whole people of God now shapes Orthodox ecclesiology and left its marks on the Council. Congar was silenced in the 1950s and became conciliar text within fifteen years. The sentence of Ratzinger that section 8 quotes waited forty-eight years to be gathered into an official Roman study. In every case the author’s standing at publication counted for nothing, and the confession of those who received the idea counted for everything, which is what this paper claims about everything. So the one who holds this confession should not wait for an answer from any dicastery, and should not need one. Reception happens at the only resolution it has ever happened at, one confessor at a time, across more years than one life holds. To hold this faith, to pray the rule above, to raise children in it, and to bear its cost quietly at the altar is not preparation for the reunion this paper proposes. It is the mechanism of it. The paper’s thesis is that verdicts belong to the whole Body and take generations, and it expects the same verdict on itself, not yet received, never condemned, and content to wait in the same channel as the faith it confesses. And it has already done the first thing a confession does. The men who wrote it were being pressed toward despair on one side and absurdity on the other, and they now stand somewhere coherent, at a known cost, on purpose. That is the world a confession changes first, and it is not a small one.</w:t>
-      </w:r>
-    </w:p>
-    <w:bookmarkEnd w:id="131"/>
-    <w:bookmarkEnd w:id="132"/>
+    <w:bookmarkStart w:id="123" w:name="the-ask."/>
+    <w:p>
+      <w:pPr>
+        <w:pStyle w:val="Heading4"/>
+      </w:pPr>
+      <w:r>
+        <w:t xml:space="preserve">The ask.</w:t>
+      </w:r>
+    </w:p>
+    <w:p>
+      <w:pPr>
+        <w:pStyle w:val="FirstParagraph"/>
+      </w:pPr>
+      <w:r>
+        <w:t xml:space="preserve">That the dialogue bodies examine the material-reception thesis and the proposal of mutual professions, and that the paper be read as what it is, a working paper in eight sections written for this examination, opening with the confession it defends and closing with appendices that grade every act weighed and apply the rules to the hard cases. Its weighings are made by fallible readers and are submitted into the same reception they describe.</w:t>
+      </w:r>
+    </w:p>
+    <w:bookmarkEnd w:id="123"/>
+    <w:bookmarkEnd w:id="124"/>
     <w:sectPr>
       <w:footnotePr>
         <w:numRestart w:val="eachSect"/>
@@ -6081,289 +5059,8 @@
       </w:pPr>
     </w:lvl>
   </w:abstractNum>
-  <w:abstractNum w:abstractNumId="991">
-    <w:nsid w:val="0000A991"/>
-    <w:multiLevelType w:val="multilevel"/>
-    <w:lvl w:ilvl="0">
-      <w:numFmt w:val="bullet"/>
-      <w:lvlText w:val=""/>
-      <w:lvlJc w:val="left"/>
-      <w:pPr>
-        <w:ind w:left="720" w:hanging="360"/>
-      </w:pPr>
-      <w:rPr>
-        <w:rFonts w:ascii="Symbol" w:hAnsi="Symbol" w:cs="Symbol" w:hint="default"/>
-      </w:rPr>
-    </w:lvl>
-    <w:lvl w:ilvl="1">
-      <w:numFmt w:val="bullet"/>
-      <w:lvlText w:val="o"/>
-      <w:lvlJc w:val="left"/>
-      <w:pPr>
-        <w:ind w:left="1440" w:hanging="360"/>
-      </w:pPr>
-      <w:rPr>
-        <w:rFonts w:ascii="Courier New" w:hAnsi="Courier New" w:cs="Courier New" w:hint="default"/>
-      </w:rPr>
-    </w:lvl>
-    <w:lvl w:ilvl="2">
-      <w:numFmt w:val="bullet"/>
-      <w:lvlText w:val=""/>
-      <w:lvlJc w:val="left"/>
-      <w:pPr>
-        <w:ind w:left="2160" w:hanging="360"/>
-      </w:pPr>
-      <w:rPr>
-        <w:rFonts w:ascii="Wingdings" w:hAnsi="Wingdings" w:cs="Wingdings" w:hint="default"/>
-      </w:rPr>
-    </w:lvl>
-    <w:lvl w:ilvl="3">
-      <w:numFmt w:val="bullet"/>
-      <w:lvlText w:val=""/>
-      <w:lvlJc w:val="left"/>
-      <w:pPr>
-        <w:ind w:left="2880" w:hanging="360"/>
-      </w:pPr>
-      <w:rPr>
-        <w:rFonts w:ascii="Symbol" w:hAnsi="Symbol" w:cs="Symbol" w:hint="default"/>
-      </w:rPr>
-    </w:lvl>
-    <w:lvl w:ilvl="4">
-      <w:numFmt w:val="bullet"/>
-      <w:lvlText w:val="o"/>
-      <w:lvlJc w:val="left"/>
-      <w:pPr>
-        <w:ind w:left="3600" w:hanging="360"/>
-      </w:pPr>
-      <w:rPr>
-        <w:rFonts w:ascii="Courier New" w:hAnsi="Courier New" w:cs="Courier New" w:hint="default"/>
-      </w:rPr>
-    </w:lvl>
-    <w:lvl w:ilvl="5">
-      <w:numFmt w:val="bullet"/>
-      <w:lvlText w:val=""/>
-      <w:lvlJc w:val="left"/>
-      <w:pPr>
-        <w:ind w:left="4320" w:hanging="360"/>
-      </w:pPr>
-      <w:rPr>
-        <w:rFonts w:ascii="Wingdings" w:hAnsi="Wingdings" w:cs="Wingdings" w:hint="default"/>
-      </w:rPr>
-    </w:lvl>
-    <w:lvl w:ilvl="6">
-      <w:numFmt w:val="bullet"/>
-      <w:lvlText w:val=""/>
-      <w:lvlJc w:val="left"/>
-      <w:pPr>
-        <w:ind w:left="5040" w:hanging="360"/>
-      </w:pPr>
-      <w:rPr>
-        <w:rFonts w:ascii="Symbol" w:hAnsi="Symbol" w:cs="Symbol" w:hint="default"/>
-      </w:rPr>
-    </w:lvl>
-    <w:lvl w:ilvl="7">
-      <w:numFmt w:val="bullet"/>
-      <w:lvlText w:val="o"/>
-      <w:lvlJc w:val="left"/>
-      <w:pPr>
-        <w:ind w:left="5760" w:hanging="360"/>
-      </w:pPr>
-      <w:rPr>
-        <w:rFonts w:ascii="Courier New" w:hAnsi="Courier New" w:cs="Courier New" w:hint="default"/>
-      </w:rPr>
-    </w:lvl>
-    <w:lvl w:ilvl="8">
-      <w:numFmt w:val="bullet"/>
-      <w:lvlText w:val=""/>
-      <w:lvlJc w:val="left"/>
-      <w:pPr>
-        <w:ind w:left="6480" w:hanging="360"/>
-      </w:pPr>
-      <w:rPr>
-        <w:rFonts w:ascii="Wingdings" w:hAnsi="Wingdings" w:cs="Wingdings" w:hint="default"/>
-      </w:rPr>
-    </w:lvl>
-  </w:abstractNum>
-  <w:abstractNum w:abstractNumId="99201">
-    <w:nsid w:val="00A99201"/>
-    <w:multiLevelType w:val="multilevel"/>
-    <w:lvl w:ilvl="0">
-      <w:start w:val="1"/>
-      <w:numFmt w:val="decimal"/>
-      <w:lvlText w:val="%1."/>
-      <w:lvlJc w:val="left"/>
-      <w:pPr>
-        <w:ind w:left="720" w:hanging="360"/>
-      </w:pPr>
-    </w:lvl>
-    <w:lvl w:ilvl="1">
-      <w:start w:val="1"/>
-      <w:numFmt w:val="lowerLetter"/>
-      <w:lvlText w:val="%2."/>
-      <w:lvlJc w:val="left"/>
-      <w:pPr>
-        <w:ind w:left="1440" w:hanging="360"/>
-      </w:pPr>
-    </w:lvl>
-    <w:lvl w:ilvl="2">
-      <w:start w:val="1"/>
-      <w:numFmt w:val="lowerRoman"/>
-      <w:lvlText w:val="%3."/>
-      <w:lvlJc w:val="left"/>
-      <w:pPr>
-        <w:ind w:left="2160" w:hanging="360"/>
-      </w:pPr>
-    </w:lvl>
-    <w:lvl w:ilvl="3">
-      <w:start w:val="1"/>
-      <w:numFmt w:val="decimal"/>
-      <w:lvlText w:val="%4."/>
-      <w:lvlJc w:val="left"/>
-      <w:pPr>
-        <w:ind w:left="2880" w:hanging="360"/>
-      </w:pPr>
-    </w:lvl>
-    <w:lvl w:ilvl="4">
-      <w:start w:val="1"/>
-      <w:numFmt w:val="lowerLetter"/>
-      <w:lvlText w:val="%5."/>
-      <w:lvlJc w:val="left"/>
-      <w:pPr>
-        <w:ind w:left="3600" w:hanging="360"/>
-      </w:pPr>
-    </w:lvl>
-    <w:lvl w:ilvl="5">
-      <w:start w:val="1"/>
-      <w:numFmt w:val="lowerRoman"/>
-      <w:lvlText w:val="%6."/>
-      <w:lvlJc w:val="left"/>
-      <w:pPr>
-        <w:ind w:left="4320" w:hanging="360"/>
-      </w:pPr>
-    </w:lvl>
-    <w:lvl w:ilvl="6">
-      <w:start w:val="1"/>
-      <w:numFmt w:val="decimal"/>
-      <w:lvlText w:val="%7."/>
-      <w:lvlJc w:val="left"/>
-      <w:pPr>
-        <w:ind w:left="5040" w:hanging="360"/>
-      </w:pPr>
-    </w:lvl>
-    <w:lvl w:ilvl="7">
-      <w:start w:val="1"/>
-      <w:numFmt w:val="lowerLetter"/>
-      <w:lvlText w:val="%8."/>
-      <w:lvlJc w:val="left"/>
-      <w:pPr>
-        <w:ind w:left="5760" w:hanging="360"/>
-      </w:pPr>
-    </w:lvl>
-    <w:lvl w:ilvl="8">
-      <w:start w:val="1"/>
-      <w:numFmt w:val="lowerRoman"/>
-      <w:lvlText w:val="%9."/>
-      <w:lvlJc w:val="left"/>
-      <w:pPr>
-        <w:ind w:left="6480" w:hanging="360"/>
-      </w:pPr>
-    </w:lvl>
-  </w:abstractNum>
   <w:num w:numId="1000">
     <w:abstractNumId w:val="990"/>
-  </w:num>
-  <w:num w:numId="1001">
-    <w:abstractNumId w:val="991"/>
-  </w:num>
-  <w:num w:numId="1002">
-    <w:abstractNumId w:val="99201"/>
-    <w:lvlOverride w:ilvl="0">
-      <w:startOverride w:val="1"/>
-    </w:lvlOverride>
-    <w:lvlOverride w:ilvl="1">
-      <w:startOverride w:val="1"/>
-    </w:lvlOverride>
-    <w:lvlOverride w:ilvl="2">
-      <w:startOverride w:val="1"/>
-    </w:lvlOverride>
-    <w:lvlOverride w:ilvl="3">
-      <w:startOverride w:val="1"/>
-    </w:lvlOverride>
-    <w:lvlOverride w:ilvl="4">
-      <w:startOverride w:val="1"/>
-    </w:lvlOverride>
-    <w:lvlOverride w:ilvl="5">
-      <w:startOverride w:val="1"/>
-    </w:lvlOverride>
-    <w:lvlOverride w:ilvl="6">
-      <w:startOverride w:val="1"/>
-    </w:lvlOverride>
-    <w:lvlOverride w:ilvl="7">
-      <w:startOverride w:val="1"/>
-    </w:lvlOverride>
-    <w:lvlOverride w:ilvl="8">
-      <w:startOverride w:val="1"/>
-    </w:lvlOverride>
-  </w:num>
-  <w:num w:numId="1003">
-    <w:abstractNumId w:val="99201"/>
-    <w:lvlOverride w:ilvl="0">
-      <w:startOverride w:val="1"/>
-    </w:lvlOverride>
-    <w:lvlOverride w:ilvl="1">
-      <w:startOverride w:val="1"/>
-    </w:lvlOverride>
-    <w:lvlOverride w:ilvl="2">
-      <w:startOverride w:val="1"/>
-    </w:lvlOverride>
-    <w:lvlOverride w:ilvl="3">
-      <w:startOverride w:val="1"/>
-    </w:lvlOverride>
-    <w:lvlOverride w:ilvl="4">
-      <w:startOverride w:val="1"/>
-    </w:lvlOverride>
-    <w:lvlOverride w:ilvl="5">
-      <w:startOverride w:val="1"/>
-    </w:lvlOverride>
-    <w:lvlOverride w:ilvl="6">
-      <w:startOverride w:val="1"/>
-    </w:lvlOverride>
-    <w:lvlOverride w:ilvl="7">
-      <w:startOverride w:val="1"/>
-    </w:lvlOverride>
-    <w:lvlOverride w:ilvl="8">
-      <w:startOverride w:val="1"/>
-    </w:lvlOverride>
-  </w:num>
-  <w:num w:numId="1004">
-    <w:abstractNumId w:val="99201"/>
-    <w:lvlOverride w:ilvl="0">
-      <w:startOverride w:val="1"/>
-    </w:lvlOverride>
-    <w:lvlOverride w:ilvl="1">
-      <w:startOverride w:val="1"/>
-    </w:lvlOverride>
-    <w:lvlOverride w:ilvl="2">
-      <w:startOverride w:val="1"/>
-    </w:lvlOverride>
-    <w:lvlOverride w:ilvl="3">
-      <w:startOverride w:val="1"/>
-    </w:lvlOverride>
-    <w:lvlOverride w:ilvl="4">
-      <w:startOverride w:val="1"/>
-    </w:lvlOverride>
-    <w:lvlOverride w:ilvl="5">
-      <w:startOverride w:val="1"/>
-    </w:lvlOverride>
-    <w:lvlOverride w:ilvl="6">
-      <w:startOverride w:val="1"/>
-    </w:lvlOverride>
-    <w:lvlOverride w:ilvl="7">
-      <w:startOverride w:val="1"/>
-    </w:lvlOverride>
-    <w:lvlOverride w:ilvl="8">
-      <w:startOverride w:val="1"/>
-    </w:lvlOverride>
   </w:num>
 </w:numbering>
 </file>

</xml_diff>